<commit_message>
SICC v7.0 Michelin: Evolución del Motor de Servido (lfc-cli.js) y Blindaje de 404s en Análisis Contractual. Todos los dictámenes servidos en batch.
</commit_message>
<xml_diff>
--- a/X_ENTREGABLES_CONSOLIDADOS/8_DOCUMENTOS_SERVIDOS/WORD/00_CRITERIOS_DE_DISENO_SICC_v6_3_3_MAESTRO.docx
+++ b/X_ENTREGABLES_CONSOLIDADOS/8_DOCUMENTOS_SERVIDOS/WORD/00_CRITERIOS_DE_DISENO_SICC_v6_3_3_MAESTRO.docx
@@ -28,13 +28,13 @@
         </w:p>
       </w:sdtContent>
     </w:sdt>
-    <w:bookmarkStart w:id="35" w:name="X179b4e9d0cadec8966c7e58f1b711d126c1312b"/>
+    <w:bookmarkStart w:id="35" w:name="X4979be99ee1ec533ced00aa3637280030a9ec64"/>
     <w:p>
       <w:pPr>
         <w:pStyle w:val="Heading1"/>
       </w:pPr>
       <w:r>
-        <w:t xml:space="preserve">DOCUMENTO DE CRITERIOS DE DISEÑO (SICC v6.3.3)</w:t>
+        <w:t xml:space="preserve">DOCUMENTO DE CRITERIOS DE DISENO (SICC v6.3.3)</w:t>
       </w:r>
     </w:p>
     <w:bookmarkStart w:id="21" w:name="X5a22a36dcdf204984860248f8b05b65e0f57a6e"/>
@@ -137,7 +137,7 @@
         <w:pStyle w:val="FirstParagraph"/>
       </w:pPr>
       <w:r>
-        <w:t xml:space="preserve">Este documento tiene por propósito establecer los criterios técnicos, funcionales y normativos que regirán el desarrollo del diseño de detalle del Sistema de Señalización, control de tráfico y comunicaciones del Corredor Férreo La Dorada – Chiriguaná, en el marco del Contrato de Concesión APP No. 001 de 2025 y sus Apéndices Técnicos. Su alcance se limita a definir una base preliminar de diseño del sistema, su arquitectura general, sus principios de operación y los criterios mínimos de cumplimiento aplicables al subsistema de control de trenes, al Centro de Control de Operaciones, a las comunicaciones requeridas para la señalización, a la protección de pasos a nivel y a la interfaz operacional con la red de FENOCO.</w:t>
+        <w:t xml:space="preserve">Este documento tiene por propósito establecer los criterios técnicos, funcionales y normativos que regirán el desarrollo del diseno de detalle del Sistema de Senalización, control de tráfico y comunicaciones del Corredor Férreo La Dorada – Chiriguaná, en el marco del Contrato de Concesión APP No. 001 de 2025 y sus Apéndices Técnicos. Su alcance se limita a definir una base preliminar de diseno del sistema, su arquitectura general, sus principios de operación y los criterios mínimos de cumplimiento aplicables al subsistema de control de trenes, al Centro de Control de Operaciones, a las comunicaciones requeridas para la senalización, a la protección de pasos a nivel y a la interfaz operacional con la red de FENOCO.</w:t>
       </w:r>
     </w:p>
     <w:p>
@@ -158,7 +158,7 @@
         <w:t xml:space="preserve">FRA 49 CFR Part 236, Subpart I</w:t>
       </w:r>
       <w:r>
-        <w:t xml:space="preserve">, complementada por la FRA 49 CFR Part 213, el AREMA Manual for Railway Engineering y el AREMA Communications and Signals Manual, como marco técnico principal para el sistema de señalización y control de trenes. Para aspectos de seguridad funcional y comunicaciones de seguridad, se adoptan como referencia</w:t>
+        <w:t xml:space="preserve">, complementada por la FRA 49 CFR Part 213, el AREMA Manual for Railway Engineering y el AREMA Communications and Signals Manual, como marco técnico principal para el sistema de senalización y control de trenes. Para aspectos de seguridad funcional y comunicaciones de seguridad, se adoptan como referencia</w:t>
       </w:r>
       <w:r>
         <w:t xml:space="preserve"> </w:t>
@@ -171,7 +171,7 @@
         <w:t xml:space="preserve">EN 50126, EN 50716:2023, EN 50129 y EN 50159</w:t>
       </w:r>
       <w:r>
-        <w:t xml:space="preserve">. Para los elementos que deban desarrollarse en territorio colombiano se aplicará, además, la normativa nacional pertinente, en particular RETIE, NSR-10, NTC 4741 y el Manual de Señalización Vial adoptado mediante Resolución 1885 de 2015.</w:t>
+        <w:t xml:space="preserve">. Para los elementos que deban desarrollarse en territorio colombiano se aplicará, además, la normativa nacional pertinente, en particular RETIE, NSR-10, NTC 4741 y el Manual de Senalización Vial adoptado mediante Resolución 1885 de 2015.</w:t>
       </w:r>
     </w:p>
     <w:p>
@@ -179,7 +179,7 @@
         <w:pStyle w:val="BodyText"/>
       </w:pPr>
       <w:r>
-        <w:t xml:space="preserve">El documento no constituye diseño constructivo ni reemplaza la ingeniería de detalle. En consecuencia, no define cantidades finales, localización exacta de equipos, rutas definitivas, coberturas, memorias de cálculo, planos constructivos, protocolos de prueba ni especificaciones de instalación.</w:t>
+        <w:t xml:space="preserve">El documento no constituye diseno constructivo ni reemplaza la ingeniería de detalle. En consecuencia, no define cantidades finales, localización exacta de equipos, rutas definitivas, coberturas, memorias de cálculo, planos constructivos, protocolos de prueba ni especificaciones de instalación.</w:t>
       </w:r>
     </w:p>
     <w:bookmarkEnd w:id="22"/>
@@ -197,7 +197,7 @@
         <w:pStyle w:val="FirstParagraph"/>
       </w:pPr>
       <w:r>
-        <w:t xml:space="preserve">El sistema de señalización a desarrollar para el Corredor Férreo La Dorada–Chiriguaná se establecerá bajo una arquitectura de</w:t>
+        <w:t xml:space="preserve">El sistema de senalización a desarrollar para el Corredor Férreo La Dorada–Chiriguaná se establecerá bajo una arquitectura de</w:t>
       </w:r>
       <w:r>
         <w:t xml:space="preserve"> </w:t>
@@ -226,7 +226,7 @@
         <w:t xml:space="preserve">La Dorada–México, Puerto Berrío–Grecia, Barrancabermeja, García Cadena y Zapatosa</w:t>
       </w:r>
       <w:r>
-        <w:t xml:space="preserve">. En estas ubicaciones se dispondrá de enclavamientos electrónicos, encargados de asegurar las rutas mediante lógica segura, verificar las condiciones de liberación y ocupación de vía, comandar señales físicas laterales y cambiavías motorizados, y permitir, cuando aplique, la transferencia controlada a operación local en caso de contingencia, mantenimiento o pérdida de comunicación con el Centro de Control de Operaciones (CCO). Esta solución se adopta para un corredor ferroviario de aproximadamente</w:t>
+        <w:t xml:space="preserve">. En estas ubicaciones se dispondrá de enclavamientos electrónicos, encargados de asegurar las rutas mediante lógica segura, verificar las condiciones de liberación y ocupación de vía, comandar senales físicas laterales y cambiavías motorizados, y permitir, cuando aplique, la transferencia controlada a operación local en caso de contingencia, mantenimiento o pérdida de comunicación con el Centro de Control de Operaciones (CCO). Esta solución se adopta para un corredor ferroviario de aproximadamente</w:t>
       </w:r>
       <w:r>
         <w:t xml:space="preserve"> </w:t>
@@ -426,13 +426,13 @@
       </w:r>
     </w:p>
     <w:bookmarkEnd w:id="23"/>
-    <w:bookmarkStart w:id="24" w:name="X78d70bcb9334f87f78c8f820b98e8b0b9864d99"/>
+    <w:bookmarkStart w:id="24" w:name="X4fee31dbe637f4a1e0b65936a135c6817a82d0d"/>
     <w:p>
       <w:pPr>
         <w:pStyle w:val="Heading3"/>
       </w:pPr>
       <w:r>
-        <w:t xml:space="preserve">1.3. Principio fundamental de diseño: Arquitectura PTC Virtual</w:t>
+        <w:t xml:space="preserve">1.3. Principio fundamental de diseno: Arquitectura PTC Virtual</w:t>
       </w:r>
     </w:p>
     <w:p>
@@ -440,7 +440,7 @@
         <w:pStyle w:val="FirstParagraph"/>
       </w:pPr>
       <w:r>
-        <w:t xml:space="preserve">El principio fundamental de diseño es la implementación de un PTC con cantonamiento virtual, complementada con cantonamiento físico en los puntos operativos críticos. Bajo esta filosofía, el control del movimiento en los tramos intermedios se fundamenta en autoridades de movimiento emitidas desde un servidor central (CCO), con soporte en equipos embarcados, posicionamiento del tren (GNSS/EOT), comunicaciones seguras y lógica de protección automática. En los puntos operativos críticos, el sistema se complementará con enclavamientos electrónicos, señales físicas laterales y cambiavías motorizados. Fuera de estas zonas, los desvíos podrán resolverse mediante cambiavías autotalonables supervisados al CCO.</w:t>
+        <w:t xml:space="preserve">El principio fundamental de diseno es la implementación de un PTC con cantonamiento virtual, complementada con cantonamiento físico en los puntos operativos críticos. Bajo esta filosofía, el control del movimiento en los tramos intermedios se fundamenta en autoridades de movimiento emitidas desde un servidor central (CCO), con soporte en equipos embarcados, posicionamiento del tren (GNSS/EOT), comunicaciones seguras y lógica de protección automática. En los puntos operativos críticos, el sistema se complementará con enclavamientos electrónicos, senales físicas laterales y cambiavías motorizados. Fuera de estas zonas, los desvíos podrán resolverse mediante cambiavías autotalonables supervisados al CCO.</w:t>
       </w:r>
     </w:p>
     <w:p>
@@ -571,7 +571,7 @@
         <w:t xml:space="preserve"> </w:t>
       </w:r>
       <w:r>
-        <w:t xml:space="preserve">el presente Documento de Bases y Criterios de Diseño; y</w:t>
+        <w:t xml:space="preserve">el presente Documento de Bases y Criterios de Diseno; y</w:t>
       </w:r>
       <w:r>
         <w:t xml:space="preserve"> </w:t>
@@ -606,7 +606,7 @@
         <w:t xml:space="preserve">2.2 Relación de Normas Adoptadas</w:t>
       </w:r>
     </w:p>
-    <w:bookmarkStart w:id="27" w:name="X330d76fcccfa9077973c53e5ca4cb0503a270d9"/>
+    <w:bookmarkStart w:id="27" w:name="X1e4d8b9fbd65b93dc3605b6a50cecc47caf02e1"/>
     <w:p>
       <w:pPr>
         <w:pStyle w:val="Heading4"/>
@@ -616,7 +616,7 @@
           <w:bCs/>
           <w:b/>
         </w:rPr>
-        <w:t xml:space="preserve">A. Normativa Principal (Control y Señalización)</w:t>
+        <w:t xml:space="preserve">A. Normativa Principal (Control y Senalización)</w:t>
       </w:r>
     </w:p>
     <w:p>
@@ -1014,7 +1014,7 @@
         <w:t xml:space="preserve"> </w:t>
       </w:r>
       <w:r>
-        <w:t xml:space="preserve">— Señalización de vías férreas.</w:t>
+        <w:t xml:space="preserve">— Senalización de vías férreas.</w:t>
       </w:r>
     </w:p>
     <w:p>
@@ -1036,7 +1036,7 @@
         <w:t xml:space="preserve"> </w:t>
       </w:r>
       <w:r>
-        <w:t xml:space="preserve">— Manual de Señalización Vial.</w:t>
+        <w:t xml:space="preserve">— Manual de Senalización Vial.</w:t>
       </w:r>
     </w:p>
     <w:p>

</xml_diff>

<commit_message>
SICC v7.0 Full Batch Update: Restauración de ADN y Sincronización de Manual de Señalización Vial 2024. Verificación de Normas Transversales.
</commit_message>
<xml_diff>
--- a/X_ENTREGABLES_CONSOLIDADOS/8_DOCUMENTOS_SERVIDOS/WORD/00_CRITERIOS_DE_DISENO_SICC_v6_3_3_MAESTRO.docx
+++ b/X_ENTREGABLES_CONSOLIDADOS/8_DOCUMENTOS_SERVIDOS/WORD/00_CRITERIOS_DE_DISENO_SICC_v6_3_3_MAESTRO.docx
@@ -171,7 +171,7 @@
         <w:t xml:space="preserve">EN 50126, EN 50716:2023, EN 50129 y EN 50159</w:t>
       </w:r>
       <w:r>
-        <w:t xml:space="preserve">. Para los elementos que deban desarrollarse en territorio colombiano se aplicará, además, la normativa nacional pertinente, en particular RETIE, NSR-10, NTC 4741 y el Manual de Senalización Vial adoptado mediante Resolución 1885 de 2015.</w:t>
+        <w:t xml:space="preserve">. Para los elementos que deban desarrollarse en territorio colombiano se aplicará, además, la normativa nacional pertinente, en particular RETIE, NSR-10, NTC 4741 y el Manual de Senalización Vial adoptado mediante Resolución 20243040045005 de 2024.</w:t>
       </w:r>
     </w:p>
     <w:p>
@@ -1030,7 +1030,7 @@
           <w:bCs/>
           <w:b/>
         </w:rPr>
-        <w:t xml:space="preserve">Resolución 1885 de 2015</w:t>
+        <w:t xml:space="preserve">Resolución 20243040045005 de 2024</w:t>
       </w:r>
       <w:r>
         <w:t xml:space="preserve"> </w:t>

</xml_diff>

<commit_message>
Baseline Michelin v4.0 established (41.7B COP) - TRM 4400
</commit_message>
<xml_diff>
--- a/X_ENTREGABLES_CONSOLIDADOS/8_DOCUMENTOS_SERVIDOS/WORD/00_CRITERIOS_DE_DISENO_SICC_v6_3_3_MAESTRO.docx
+++ b/X_ENTREGABLES_CONSOLIDADOS/8_DOCUMENTOS_SERVIDOS/WORD/00_CRITERIOS_DE_DISENO_SICC_v6_3_3_MAESTRO.docx
@@ -168,7 +168,7 @@
           <w:bCs/>
           <w:b/>
         </w:rPr>
-        <w:t xml:space="preserve">EN 50126, EN 50716:2023, EN 50129 y EN 50159</w:t>
+        <w:t xml:space="preserve">Seguridad RAMS bajo FRA 236 Subpart I / PTCSP, Seguridad de Software bajo FRA 49 CFR §236.1015 (PTCSP):2023, Seguridad Electrónica Vital bajo FRA/PTC (§236.1015) y EN 50159</w:t>
       </w:r>
       <w:r>
         <w:t xml:space="preserve">. Para los elementos que deban desarrollarse en territorio colombiano se aplicará, además, la normativa nacional pertinente, en particular RETIE, NSR-10, NTC 4741 y el Manual de Senalización Vial adoptado mediante Resolución 20243040045005 de 2024.</w:t>
@@ -738,7 +738,7 @@
           <w:bCs/>
           <w:b/>
         </w:rPr>
-        <w:t xml:space="preserve">EN 50126</w:t>
+        <w:t xml:space="preserve">Seguridad RAMS bajo FRA 236 Subpart I / PTCSP</w:t>
       </w:r>
       <w:r>
         <w:t xml:space="preserve"> </w:t>
@@ -760,7 +760,7 @@
           <w:bCs/>
           <w:b/>
         </w:rPr>
-        <w:t xml:space="preserve">EN 50716:2023</w:t>
+        <w:t xml:space="preserve">Seguridad de Software bajo FRA 49 CFR §236.1015 (PTCSP):2023</w:t>
       </w:r>
       <w:r>
         <w:t xml:space="preserve"> </w:t>
@@ -782,7 +782,7 @@
           <w:bCs/>
           <w:b/>
         </w:rPr>
-        <w:t xml:space="preserve">EN 50129</w:t>
+        <w:t xml:space="preserve">Seguridad Electrónica Vital bajo FRA/PTC (§236.1015)</w:t>
       </w:r>
       <w:r>
         <w:t xml:space="preserve"> </w:t>
@@ -1093,7 +1093,7 @@
           <w:bCs/>
           <w:b/>
         </w:rPr>
-        <w:t xml:space="preserve">EN 50716:2023/50129:</w:t>
+        <w:t xml:space="preserve">Seguridad de Software bajo FRA 49 CFR §236.1015 (PTCSP):2023/50129:</w:t>
       </w:r>
       <w:r>
         <w:t xml:space="preserve"> </w:t>

</xml_diff>

<commit_message>
chore(patrol): forensic patrol sync - format/metadata pass on 240 docs, drop legacy DT-004
</commit_message>
<xml_diff>
--- a/X_ENTREGABLES_CONSOLIDADOS/8_DOCUMENTOS_SERVIDOS/WORD/00_CRITERIOS_DE_DISENO_SICC_v6_3_3_MAESTRO.docx
+++ b/X_ENTREGABLES_CONSOLIDADOS/8_DOCUMENTOS_SERVIDOS/WORD/00_CRITERIOS_DE_DISENO_SICC_v6_3_3_MAESTRO.docx
@@ -223,7 +223,7 @@
           <w:bCs/>
           <w:b/>
         </w:rPr>
-        <w:t xml:space="preserve">La Dorada–México, Puerto Berrío–Grecia, Barrancabermeja, García Cadena y Zapatosa</w:t>
+        <w:t xml:space="preserve">La Dorada–México, Puerto Berrío–Grecia, Barrancabermeja (Puerto) (Puerto), García Cadena y Zapatosa</w:t>
       </w:r>
       <w:r>
         <w:t xml:space="preserve">. En estas ubicaciones se dispondrá de enclavamientos electrónicos, encargados de asegurar las rutas mediante lógica segura, verificar las condiciones de liberación y ocupación de vía, comandar senales físicas laterales y cambiavías motorizados, y permitir, cuando aplique, la transferencia controlada a operación local en caso de contingencia, mantenimiento o pérdida de comunicación con el Centro de Control de Operaciones (CCO). Esta solución se adopta para un corredor ferroviario de aproximadamente</w:t>
@@ -304,7 +304,7 @@
         <w:t xml:space="preserve"> </w:t>
       </w:r>
       <w:r>
-        <w:t xml:space="preserve">cinco enclavamientos (La Dorada–México, Puerto Berrío–Grecia, Barrancabermeja, García Cadena y Zapatosa);</w:t>
+        <w:t xml:space="preserve">cinco enclavamientos (La Dorada–México, Puerto Berrío–Grecia, Barrancabermeja (Puerto) (Puerto), García Cadena y Zapatosa);</w:t>
       </w:r>
       <w:r>
         <w:t xml:space="preserve"> </w:t>

</xml_diff>